<commit_message>
Implemented new TVNL-NNA Solver
Implemented new approach to MNA algorithm, which is data driven generates the system equations using template XML files which represent the different elements in the networks.
Also extended the algorithm to cover time variant elements.

Started developing an approach to solving the DAE equations in Matlab.
</commit_message>
<xml_diff>
--- a/Dokumente/Elektron Flow Theorien Zusammenfassung.docx
+++ b/Dokumente/Elektron Flow Theorien Zusammenfassung.docx
@@ -18943,404 +18943,6 @@
           <w:rFonts w:ascii="Times New Roman" w:eastAsiaTheme="minorEastAsia" w:hAnsi="Times New Roman" w:cs="Times New Roman"/>
         </w:rPr>
       </w:pPr>
-      <w:r>
-        <w:rPr>
-          <w:rFonts w:ascii="Times New Roman" w:eastAsiaTheme="minorEastAsia" w:hAnsi="Times New Roman" w:cs="Times New Roman"/>
-        </w:rPr>
-        <w:t>NOTIZ: Ergebnis prüfen</w:t>
-      </w:r>
-    </w:p>
-    <w:p>
-      <w:pPr>
-        <w:rPr>
-          <w:rFonts w:ascii="Times New Roman" w:eastAsiaTheme="minorEastAsia" w:hAnsi="Times New Roman" w:cs="Times New Roman"/>
-        </w:rPr>
-      </w:pPr>
-      <m:oMathPara>
-        <m:oMath>
-          <m:r>
-            <w:rPr>
-              <w:rFonts w:ascii="Cambria Math" w:eastAsiaTheme="minorEastAsia" w:hAnsi="Cambria Math" w:cs="Times New Roman"/>
-            </w:rPr>
-            <m:t>I=</m:t>
-          </m:r>
-          <m:d>
-            <m:dPr>
-              <m:begChr m:val="["/>
-              <m:endChr m:val="]"/>
-              <m:ctrlPr>
-                <w:rPr>
-                  <w:rFonts w:ascii="Cambria Math" w:eastAsiaTheme="minorEastAsia" w:hAnsi="Cambria Math" w:cs="Times New Roman"/>
-                  <w:i/>
-                </w:rPr>
-              </m:ctrlPr>
-            </m:dPr>
-            <m:e>
-              <m:m>
-                <m:mPr>
-                  <m:mcs>
-                    <m:mc>
-                      <m:mcPr>
-                        <m:count m:val="1"/>
-                        <m:mcJc m:val="center"/>
-                      </m:mcPr>
-                    </m:mc>
-                  </m:mcs>
-                  <m:ctrlPr>
-                    <w:rPr>
-                      <w:rFonts w:ascii="Cambria Math" w:eastAsiaTheme="minorEastAsia" w:hAnsi="Cambria Math" w:cs="Times New Roman"/>
-                      <w:i/>
-                    </w:rPr>
-                  </m:ctrlPr>
-                </m:mPr>
-                <m:mr>
-                  <m:e>
-                    <m:r>
-                      <w:rPr>
-                        <w:rFonts w:ascii="Cambria Math" w:eastAsiaTheme="minorEastAsia" w:hAnsi="Cambria Math" w:cs="Times New Roman"/>
-                      </w:rPr>
-                      <m:t>-</m:t>
-                    </m:r>
-                    <m:f>
-                      <m:fPr>
-                        <m:ctrlPr>
-                          <w:rPr>
-                            <w:rFonts w:ascii="Cambria Math" w:eastAsiaTheme="minorEastAsia" w:hAnsi="Cambria Math" w:cs="Times New Roman"/>
-                            <w:i/>
-                          </w:rPr>
-                        </m:ctrlPr>
-                      </m:fPr>
-                      <m:num>
-                        <m:r>
-                          <w:rPr>
-                            <w:rFonts w:ascii="Cambria Math" w:eastAsiaTheme="minorEastAsia" w:hAnsi="Cambria Math" w:cs="Times New Roman"/>
-                          </w:rPr>
-                          <m:t>2625250</m:t>
-                        </m:r>
-                      </m:num>
-                      <m:den>
-                        <m:r>
-                          <w:rPr>
-                            <w:rFonts w:ascii="Cambria Math" w:eastAsiaTheme="minorEastAsia" w:hAnsi="Cambria Math" w:cs="Times New Roman"/>
-                          </w:rPr>
-                          <m:t>257401</m:t>
-                        </m:r>
-                      </m:den>
-                    </m:f>
-                  </m:e>
-                </m:mr>
-                <m:mr>
-                  <m:e>
-                    <m:r>
-                      <w:rPr>
-                        <w:rFonts w:ascii="Cambria Math" w:eastAsiaTheme="minorEastAsia" w:hAnsi="Cambria Math" w:cs="Times New Roman"/>
-                      </w:rPr>
-                      <m:t>-</m:t>
-                    </m:r>
-                    <m:f>
-                      <m:fPr>
-                        <m:ctrlPr>
-                          <w:rPr>
-                            <w:rFonts w:ascii="Cambria Math" w:eastAsiaTheme="minorEastAsia" w:hAnsi="Cambria Math" w:cs="Times New Roman"/>
-                            <w:i/>
-                          </w:rPr>
-                        </m:ctrlPr>
-                      </m:fPr>
-                      <m:num>
-                        <m:r>
-                          <w:rPr>
-                            <w:rFonts w:ascii="Cambria Math" w:eastAsiaTheme="minorEastAsia" w:hAnsi="Cambria Math" w:cs="Times New Roman"/>
-                          </w:rPr>
-                          <m:t>2625250</m:t>
-                        </m:r>
-                      </m:num>
-                      <m:den>
-                        <m:r>
-                          <w:rPr>
-                            <w:rFonts w:ascii="Cambria Math" w:eastAsiaTheme="minorEastAsia" w:hAnsi="Cambria Math" w:cs="Times New Roman"/>
-                          </w:rPr>
-                          <m:t>257401</m:t>
-                        </m:r>
-                      </m:den>
-                    </m:f>
-                  </m:e>
-                </m:mr>
-                <m:mr>
-                  <m:e>
-                    <m:r>
-                      <w:rPr>
-                        <w:rFonts w:ascii="Cambria Math" w:eastAsiaTheme="minorEastAsia" w:hAnsi="Cambria Math" w:cs="Times New Roman"/>
-                      </w:rPr>
-                      <m:t>-</m:t>
-                    </m:r>
-                    <m:f>
-                      <m:fPr>
-                        <m:ctrlPr>
-                          <w:rPr>
-                            <w:rFonts w:ascii="Cambria Math" w:eastAsiaTheme="minorEastAsia" w:hAnsi="Cambria Math" w:cs="Times New Roman"/>
-                            <w:i/>
-                          </w:rPr>
-                        </m:ctrlPr>
-                      </m:fPr>
-                      <m:num>
-                        <m:r>
-                          <w:rPr>
-                            <w:rFonts w:ascii="Cambria Math" w:eastAsiaTheme="minorEastAsia" w:hAnsi="Cambria Math" w:cs="Times New Roman"/>
-                          </w:rPr>
-                          <m:t>62500</m:t>
-                        </m:r>
-                      </m:num>
-                      <m:den>
-                        <m:r>
-                          <w:rPr>
-                            <w:rFonts w:ascii="Cambria Math" w:eastAsiaTheme="minorEastAsia" w:hAnsi="Cambria Math" w:cs="Times New Roman"/>
-                          </w:rPr>
-                          <m:t>257401</m:t>
-                        </m:r>
-                      </m:den>
-                    </m:f>
-                  </m:e>
-                </m:mr>
-                <m:mr>
-                  <m:e>
-                    <m:f>
-                      <m:fPr>
-                        <m:ctrlPr>
-                          <w:rPr>
-                            <w:rFonts w:ascii="Cambria Math" w:eastAsiaTheme="minorEastAsia" w:hAnsi="Cambria Math" w:cs="Times New Roman"/>
-                            <w:i/>
-                          </w:rPr>
-                        </m:ctrlPr>
-                      </m:fPr>
-                      <m:num>
-                        <m:r>
-                          <w:rPr>
-                            <w:rFonts w:ascii="Cambria Math" w:eastAsiaTheme="minorEastAsia" w:hAnsi="Cambria Math" w:cs="Times New Roman"/>
-                          </w:rPr>
-                          <m:t>62500</m:t>
-                        </m:r>
-                      </m:num>
-                      <m:den>
-                        <m:r>
-                          <w:rPr>
-                            <w:rFonts w:ascii="Cambria Math" w:eastAsiaTheme="minorEastAsia" w:hAnsi="Cambria Math" w:cs="Times New Roman"/>
-                          </w:rPr>
-                          <m:t>257401</m:t>
-                        </m:r>
-                      </m:den>
-                    </m:f>
-                  </m:e>
-                </m:mr>
-              </m:m>
-            </m:e>
-          </m:d>
-          <m:r>
-            <w:rPr>
-              <w:rFonts w:ascii="Cambria Math" w:eastAsiaTheme="minorEastAsia" w:hAnsi="Cambria Math" w:cs="Times New Roman"/>
-            </w:rPr>
-            <m:t>≅</m:t>
-          </m:r>
-          <m:d>
-            <m:dPr>
-              <m:begChr m:val="["/>
-              <m:endChr m:val="]"/>
-              <m:ctrlPr>
-                <w:rPr>
-                  <w:rFonts w:ascii="Cambria Math" w:eastAsiaTheme="minorEastAsia" w:hAnsi="Cambria Math" w:cs="Times New Roman"/>
-                  <w:i/>
-                </w:rPr>
-              </m:ctrlPr>
-            </m:dPr>
-            <m:e>
-              <m:m>
-                <m:mPr>
-                  <m:mcs>
-                    <m:mc>
-                      <m:mcPr>
-                        <m:count m:val="1"/>
-                        <m:mcJc m:val="center"/>
-                      </m:mcPr>
-                    </m:mc>
-                  </m:mcs>
-                  <m:ctrlPr>
-                    <w:rPr>
-                      <w:rFonts w:ascii="Cambria Math" w:eastAsiaTheme="minorEastAsia" w:hAnsi="Cambria Math" w:cs="Times New Roman"/>
-                      <w:i/>
-                    </w:rPr>
-                  </m:ctrlPr>
-                </m:mPr>
-                <m:mr>
-                  <m:e>
-                    <m:r>
-                      <w:rPr>
-                        <w:rFonts w:ascii="Cambria Math" w:eastAsiaTheme="minorEastAsia" w:hAnsi="Cambria Math" w:cs="Times New Roman"/>
-                      </w:rPr>
-                      <m:t>-10.1991</m:t>
-                    </m:r>
-                  </m:e>
-                </m:mr>
-                <m:mr>
-                  <m:e>
-                    <m:r>
-                      <w:rPr>
-                        <w:rFonts w:ascii="Cambria Math" w:eastAsiaTheme="minorEastAsia" w:hAnsi="Cambria Math" w:cs="Times New Roman"/>
-                      </w:rPr>
-                      <m:t>-10.1991</m:t>
-                    </m:r>
-                  </m:e>
-                </m:mr>
-                <m:mr>
-                  <m:e>
-                    <m:r>
-                      <w:rPr>
-                        <w:rFonts w:ascii="Cambria Math" w:eastAsiaTheme="minorEastAsia" w:hAnsi="Cambria Math" w:cs="Times New Roman"/>
-                      </w:rPr>
-                      <m:t>-0.2428</m:t>
-                    </m:r>
-                  </m:e>
-                </m:mr>
-                <m:mr>
-                  <m:e>
-                    <m:r>
-                      <w:rPr>
-                        <w:rFonts w:ascii="Cambria Math" w:eastAsiaTheme="minorEastAsia" w:hAnsi="Cambria Math" w:cs="Times New Roman"/>
-                      </w:rPr>
-                      <m:t>0.2428</m:t>
-                    </m:r>
-                  </m:e>
-                </m:mr>
-              </m:m>
-            </m:e>
-          </m:d>
-        </m:oMath>
-      </m:oMathPara>
-    </w:p>
-    <w:p>
-      <w:pPr>
-        <w:rPr>
-          <w:rFonts w:ascii="Times New Roman" w:eastAsiaTheme="minorEastAsia" w:hAnsi="Times New Roman" w:cs="Times New Roman"/>
-        </w:rPr>
-      </w:pPr>
-    </w:p>
-    <w:p>
-      <w:pPr>
-        <w:rPr>
-          <w:rFonts w:ascii="Times New Roman" w:eastAsiaTheme="minorEastAsia" w:hAnsi="Times New Roman" w:cs="Times New Roman"/>
-        </w:rPr>
-      </w:pPr>
-      <m:oMathPara>
-        <m:oMath>
-          <m:sSub>
-            <m:sSubPr>
-              <m:ctrlPr>
-                <w:rPr>
-                  <w:rFonts w:ascii="Cambria Math" w:eastAsiaTheme="minorEastAsia" w:hAnsi="Cambria Math" w:cs="Times New Roman"/>
-                  <w:i/>
-                </w:rPr>
-              </m:ctrlPr>
-            </m:sSubPr>
-            <m:e>
-              <m:r>
-                <w:rPr>
-                  <w:rFonts w:ascii="Cambria Math" w:eastAsiaTheme="minorEastAsia" w:hAnsi="Cambria Math" w:cs="Times New Roman"/>
-                </w:rPr>
-                <m:t>I</m:t>
-              </m:r>
-            </m:e>
-            <m:sub>
-              <m:r>
-                <w:rPr>
-                  <w:rFonts w:ascii="Cambria Math" w:eastAsiaTheme="minorEastAsia" w:hAnsi="Cambria Math" w:cs="Times New Roman"/>
-                </w:rPr>
-                <m:t>R3</m:t>
-              </m:r>
-            </m:sub>
-          </m:sSub>
-          <m:r>
-            <w:rPr>
-              <w:rFonts w:ascii="Cambria Math" w:eastAsiaTheme="minorEastAsia" w:hAnsi="Cambria Math" w:cs="Times New Roman"/>
-            </w:rPr>
-            <m:t>=242.8mA</m:t>
-          </m:r>
-        </m:oMath>
-      </m:oMathPara>
-    </w:p>
-    <w:p>
-      <w:pPr>
-        <w:rPr>
-          <w:rFonts w:ascii="Times New Roman" w:eastAsiaTheme="minorEastAsia" w:hAnsi="Times New Roman" w:cs="Times New Roman"/>
-        </w:rPr>
-      </w:pPr>
-      <m:oMathPara>
-        <m:oMath>
-          <m:sSub>
-            <m:sSubPr>
-              <m:ctrlPr>
-                <w:rPr>
-                  <w:rFonts w:ascii="Cambria Math" w:eastAsiaTheme="minorEastAsia" w:hAnsi="Cambria Math" w:cs="Times New Roman"/>
-                  <w:i/>
-                </w:rPr>
-              </m:ctrlPr>
-            </m:sSubPr>
-            <m:e>
-              <m:r>
-                <w:rPr>
-                  <w:rFonts w:ascii="Cambria Math" w:eastAsiaTheme="minorEastAsia" w:hAnsi="Cambria Math" w:cs="Times New Roman"/>
-                </w:rPr>
-                <m:t>I</m:t>
-              </m:r>
-            </m:e>
-            <m:sub>
-              <m:r>
-                <w:rPr>
-                  <w:rFonts w:ascii="Cambria Math" w:eastAsiaTheme="minorEastAsia" w:hAnsi="Cambria Math" w:cs="Times New Roman"/>
-                </w:rPr>
-                <m:t>R1</m:t>
-              </m:r>
-            </m:sub>
-          </m:sSub>
-          <m:r>
-            <w:rPr>
-              <w:rFonts w:ascii="Cambria Math" w:eastAsiaTheme="minorEastAsia" w:hAnsi="Cambria Math" w:cs="Times New Roman"/>
-            </w:rPr>
-            <m:t>=10.1991A</m:t>
-          </m:r>
-        </m:oMath>
-      </m:oMathPara>
-    </w:p>
-    <w:p>
-      <w:pPr>
-        <w:rPr>
-          <w:rFonts w:ascii="Times New Roman" w:eastAsiaTheme="minorEastAsia" w:hAnsi="Times New Roman" w:cs="Times New Roman"/>
-        </w:rPr>
-      </w:pPr>
-    </w:p>
-    <w:p>
-      <w:pPr>
-        <w:rPr>
-          <w:rFonts w:ascii="Times New Roman" w:eastAsiaTheme="minorEastAsia" w:hAnsi="Times New Roman" w:cs="Times New Roman"/>
-        </w:rPr>
-      </w:pPr>
-    </w:p>
-    <w:p>
-      <w:pPr>
-        <w:rPr>
-          <w:rFonts w:ascii="Times New Roman" w:eastAsiaTheme="minorEastAsia" w:hAnsi="Times New Roman" w:cs="Times New Roman"/>
-        </w:rPr>
-      </w:pPr>
-    </w:p>
-    <w:p>
-      <w:pPr>
-        <w:rPr>
-          <w:rFonts w:ascii="Times New Roman" w:eastAsiaTheme="minorEastAsia" w:hAnsi="Times New Roman" w:cs="Times New Roman"/>
-        </w:rPr>
-      </w:pPr>
-      <w:r>
-        <w:rPr>
-          <w:rFonts w:ascii="Times New Roman" w:eastAsiaTheme="minorEastAsia" w:hAnsi="Times New Roman" w:cs="Times New Roman"/>
-        </w:rPr>
-        <w:br w:type="page"/>
-      </w:r>
     </w:p>
     <w:tbl>
       <w:tblPr>
@@ -19367,7 +18969,6 @@
               <w:rPr>
                 <w:rFonts w:ascii="Times New Roman" w:eastAsiaTheme="minorEastAsia" w:hAnsi="Times New Roman" w:cs="Times New Roman"/>
               </w:rPr>
-              <w:lastRenderedPageBreak/>
               <w:t>Funktion</w:t>
             </w:r>
           </w:p>
@@ -19402,13 +19003,7 @@
                   <w:rPr>
                     <w:rFonts w:ascii="Cambria Math" w:eastAsiaTheme="minorEastAsia" w:hAnsi="Cambria Math" w:cs="Times New Roman"/>
                   </w:rPr>
-                  <m:t>U=</m:t>
-                </m:r>
-                <m:r>
-                  <w:rPr>
-                    <w:rFonts w:ascii="Cambria Math" w:eastAsiaTheme="minorEastAsia" w:hAnsi="Cambria Math" w:cs="Times New Roman"/>
-                  </w:rPr>
-                  <m:t>V</m:t>
+                  <m:t>U=V</m:t>
                 </m:r>
                 <m:d>
                   <m:dPr>
@@ -19582,13 +19177,7 @@
                   <w:rPr>
                     <w:rFonts w:ascii="Cambria Math" w:eastAsiaTheme="minorEastAsia" w:hAnsi="Cambria Math" w:cs="Times New Roman"/>
                   </w:rPr>
-                  <m:t>U=</m:t>
-                </m:r>
-                <m:r>
-                  <w:rPr>
-                    <w:rFonts w:ascii="Cambria Math" w:eastAsiaTheme="minorEastAsia" w:hAnsi="Cambria Math" w:cs="Times New Roman"/>
-                  </w:rPr>
-                  <m:t>V</m:t>
+                  <m:t>U=V</m:t>
                 </m:r>
                 <m:d>
                   <m:dPr>
@@ -19710,25 +19299,7 @@
                   <w:rPr>
                     <w:rFonts w:ascii="Cambria Math" w:eastAsiaTheme="minorEastAsia" w:hAnsi="Cambria Math" w:cs="Times New Roman"/>
                   </w:rPr>
-                  <m:t>I=</m:t>
-                </m:r>
-                <m:r>
-                  <w:rPr>
-                    <w:rFonts w:ascii="Cambria Math" w:eastAsiaTheme="minorEastAsia" w:hAnsi="Cambria Math" w:cs="Times New Roman"/>
-                  </w:rPr>
-                  <m:t>I(</m:t>
-                </m:r>
-                <m:r>
-                  <w:rPr>
-                    <w:rFonts w:ascii="Cambria Math" w:eastAsiaTheme="minorEastAsia" w:hAnsi="Cambria Math" w:cs="Times New Roman"/>
-                  </w:rPr>
-                  <m:t>E</m:t>
-                </m:r>
-                <m:r>
-                  <w:rPr>
-                    <w:rFonts w:ascii="Cambria Math" w:eastAsiaTheme="minorEastAsia" w:hAnsi="Cambria Math" w:cs="Times New Roman"/>
-                  </w:rPr>
-                  <m:t>)</m:t>
+                  <m:t>I=I(E)</m:t>
                 </m:r>
               </m:oMath>
             </m:oMathPara>
@@ -20013,8 +19584,6 @@
           <w:lang w:val="en-US"/>
         </w:rPr>
       </w:pPr>
-      <w:bookmarkStart w:id="0" w:name="_GoBack"/>
-      <w:bookmarkEnd w:id="0"/>
     </w:p>
     <w:p>
       <w:pPr>
@@ -20064,6 +19633,7 @@
                           <a:chOff x="0" y="0"/>
                           <a:chExt cx="4214813" cy="1374429"/>
                         </a:xfrm>
+                        <a:noFill/>
                       </wpg:grpSpPr>
                       <wps:wsp>
                         <wps:cNvPr id="7" name="Rechteck 7"/>
@@ -20076,8 +19646,11 @@
                           <a:prstGeom prst="rect">
                             <a:avLst/>
                           </a:prstGeom>
-                          <a:noFill/>
+                          <a:grpFill/>
                           <a:ln>
+                            <a:solidFill>
+                              <a:schemeClr val="tx1"/>
+                            </a:solidFill>
                             <a:prstDash val="dash"/>
                           </a:ln>
                         </wps:spPr>
@@ -20115,6 +19688,12 @@
                           <a:prstGeom prst="rect">
                             <a:avLst/>
                           </a:prstGeom>
+                          <a:grpFill/>
+                          <a:ln>
+                            <a:solidFill>
+                              <a:schemeClr val="tx1"/>
+                            </a:solidFill>
+                          </a:ln>
                         </wps:spPr>
                         <wps:style>
                           <a:lnRef idx="2">
@@ -20137,8 +19716,14 @@
                             <w:p>
                               <w:pPr>
                                 <w:jc w:val="center"/>
+                                <w:rPr>
+                                  <w:color w:val="000000" w:themeColor="text1"/>
+                                </w:rPr>
                               </w:pPr>
                               <w:r>
+                                <w:rPr>
+                                  <w:color w:val="000000" w:themeColor="text1"/>
+                                </w:rPr>
                                 <w:t>Zweipol [U]</w:t>
                               </w:r>
                             </w:p>
@@ -20162,6 +19747,12 @@
                           <a:prstGeom prst="rect">
                             <a:avLst/>
                           </a:prstGeom>
+                          <a:grpFill/>
+                          <a:ln>
+                            <a:solidFill>
+                              <a:schemeClr val="tx1"/>
+                            </a:solidFill>
+                          </a:ln>
                         </wps:spPr>
                         <wps:style>
                           <a:lnRef idx="2">
@@ -20184,15 +19775,15 @@
                             <w:p>
                               <w:pPr>
                                 <w:jc w:val="center"/>
+                                <w:rPr>
+                                  <w:color w:val="000000" w:themeColor="text1"/>
+                                </w:rPr>
                               </w:pPr>
                               <w:r>
-                                <w:t>Zweipol [</w:t>
-                              </w:r>
-                              <w:r>
-                                <w:t>I</w:t>
-                              </w:r>
-                              <w:r>
-                                <w:t>]</w:t>
+                                <w:rPr>
+                                  <w:color w:val="000000" w:themeColor="text1"/>
+                                </w:rPr>
+                                <w:t>Zweipol [I]</w:t>
                               </w:r>
                             </w:p>
                           </w:txbxContent>
@@ -20215,6 +19806,12 @@
                           <a:prstGeom prst="rect">
                             <a:avLst/>
                           </a:prstGeom>
+                          <a:grpFill/>
+                          <a:ln>
+                            <a:solidFill>
+                              <a:schemeClr val="tx1"/>
+                            </a:solidFill>
+                          </a:ln>
                         </wps:spPr>
                         <wps:style>
                           <a:lnRef idx="2">
@@ -20237,12 +19834,15 @@
                             <w:p>
                               <w:pPr>
                                 <w:jc w:val="center"/>
+                                <w:rPr>
+                                  <w:color w:val="000000" w:themeColor="text1"/>
+                                </w:rPr>
                               </w:pPr>
                               <w:r>
-                                <w:t>Zweipol [</w:t>
-                              </w:r>
-                              <w:r>
-                                <w:t>R/G]</w:t>
+                                <w:rPr>
+                                  <w:color w:val="000000" w:themeColor="text1"/>
+                                </w:rPr>
+                                <w:t>Zweipol [R/G]</w:t>
                               </w:r>
                             </w:p>
                           </w:txbxContent>
@@ -20265,6 +19865,12 @@
                           <a:prstGeom prst="rect">
                             <a:avLst/>
                           </a:prstGeom>
+                          <a:grpFill/>
+                          <a:ln>
+                            <a:solidFill>
+                              <a:schemeClr val="tx1"/>
+                            </a:solidFill>
+                          </a:ln>
                         </wps:spPr>
                         <wps:style>
                           <a:lnRef idx="2">
@@ -20287,8 +19893,14 @@
                             <w:p>
                               <w:pPr>
                                 <w:jc w:val="center"/>
+                                <w:rPr>
+                                  <w:color w:val="000000" w:themeColor="text1"/>
+                                </w:rPr>
                               </w:pPr>
                               <w:r>
+                                <w:rPr>
+                                  <w:color w:val="000000" w:themeColor="text1"/>
+                                </w:rPr>
                                 <w:t>Vierpol</w:t>
                               </w:r>
                             </w:p>
@@ -20312,8 +19924,11 @@
                           <a:prstGeom prst="rect">
                             <a:avLst/>
                           </a:prstGeom>
-                          <a:noFill/>
+                          <a:grpFill/>
                           <a:ln>
+                            <a:solidFill>
+                              <a:schemeClr val="tx1"/>
+                            </a:solidFill>
                             <a:prstDash val="dash"/>
                           </a:ln>
                         </wps:spPr>
@@ -20351,6 +19966,12 @@
                           <a:prstGeom prst="rect">
                             <a:avLst/>
                           </a:prstGeom>
+                          <a:grpFill/>
+                          <a:ln>
+                            <a:solidFill>
+                              <a:schemeClr val="tx1"/>
+                            </a:solidFill>
+                          </a:ln>
                         </wps:spPr>
                         <wps:style>
                           <a:lnRef idx="2">
@@ -20373,8 +19994,14 @@
                             <w:p>
                               <w:pPr>
                                 <w:jc w:val="center"/>
+                                <w:rPr>
+                                  <w:color w:val="000000" w:themeColor="text1"/>
+                                </w:rPr>
                               </w:pPr>
                               <w:r>
+                                <w:rPr>
+                                  <w:color w:val="000000" w:themeColor="text1"/>
+                                </w:rPr>
                                 <w:t>Zweipol [U]</w:t>
                               </w:r>
                             </w:p>
@@ -20398,6 +20025,12 @@
                           <a:prstGeom prst="rect">
                             <a:avLst/>
                           </a:prstGeom>
+                          <a:grpFill/>
+                          <a:ln>
+                            <a:solidFill>
+                              <a:schemeClr val="tx1"/>
+                            </a:solidFill>
+                          </a:ln>
                         </wps:spPr>
                         <wps:style>
                           <a:lnRef idx="2">
@@ -20420,8 +20053,14 @@
                             <w:p>
                               <w:pPr>
                                 <w:jc w:val="center"/>
+                                <w:rPr>
+                                  <w:color w:val="000000" w:themeColor="text1"/>
+                                </w:rPr>
                               </w:pPr>
                               <w:r>
+                                <w:rPr>
+                                  <w:color w:val="000000" w:themeColor="text1"/>
+                                </w:rPr>
                                 <w:t>Zweipol [I]</w:t>
                               </w:r>
                             </w:p>
@@ -20445,6 +20084,12 @@
                           <a:prstGeom prst="rect">
                             <a:avLst/>
                           </a:prstGeom>
+                          <a:grpFill/>
+                          <a:ln>
+                            <a:solidFill>
+                              <a:schemeClr val="tx1"/>
+                            </a:solidFill>
+                          </a:ln>
                         </wps:spPr>
                         <wps:style>
                           <a:lnRef idx="2">
@@ -20467,14 +20112,26 @@
                             <w:p>
                               <w:pPr>
                                 <w:jc w:val="center"/>
+                                <w:rPr>
+                                  <w:color w:val="000000" w:themeColor="text1"/>
+                                </w:rPr>
                               </w:pPr>
                               <w:r>
+                                <w:rPr>
+                                  <w:color w:val="000000" w:themeColor="text1"/>
+                                </w:rPr>
                                 <w:t>Zweipol [</w:t>
                               </w:r>
                               <w:r>
+                                <w:rPr>
+                                  <w:color w:val="000000" w:themeColor="text1"/>
+                                </w:rPr>
                                 <w:t>G</w:t>
                               </w:r>
                               <w:r>
+                                <w:rPr>
+                                  <w:color w:val="000000" w:themeColor="text1"/>
+                                </w:rPr>
                                 <w:t>]</w:t>
                               </w:r>
                             </w:p>
@@ -20500,7 +20157,11 @@
                               <a:gd name="adj1" fmla="val 58767"/>
                             </a:avLst>
                           </a:prstGeom>
+                          <a:grpFill/>
                           <a:ln>
+                            <a:solidFill>
+                              <a:schemeClr val="tx1"/>
+                            </a:solidFill>
                             <a:tailEnd type="triangle"/>
                           </a:ln>
                         </wps:spPr>
@@ -20533,7 +20194,11 @@
                               <a:gd name="adj1" fmla="val 44558"/>
                             </a:avLst>
                           </a:prstGeom>
+                          <a:grpFill/>
                           <a:ln>
+                            <a:solidFill>
+                              <a:schemeClr val="tx1"/>
+                            </a:solidFill>
                             <a:tailEnd type="triangle"/>
                           </a:ln>
                         </wps:spPr>
@@ -20566,7 +20231,11 @@
                               <a:gd name="adj1" fmla="val 44361"/>
                             </a:avLst>
                           </a:prstGeom>
+                          <a:grpFill/>
                           <a:ln>
+                            <a:solidFill>
+                              <a:schemeClr val="tx1"/>
+                            </a:solidFill>
                             <a:tailEnd type="triangle"/>
                           </a:ln>
                         </wps:spPr>
@@ -20599,7 +20268,11 @@
                               <a:gd name="adj1" fmla="val 60049"/>
                             </a:avLst>
                           </a:prstGeom>
+                          <a:grpFill/>
                           <a:ln>
+                            <a:solidFill>
+                              <a:schemeClr val="tx1"/>
+                            </a:solidFill>
                             <a:tailEnd type="triangle"/>
                           </a:ln>
                         </wps:spPr>
@@ -20630,7 +20303,11 @@
                           <a:prstGeom prst="straightConnector1">
                             <a:avLst/>
                           </a:prstGeom>
+                          <a:grpFill/>
                           <a:ln>
+                            <a:solidFill>
+                              <a:schemeClr val="tx1"/>
+                            </a:solidFill>
                             <a:tailEnd type="triangle"/>
                           </a:ln>
                         </wps:spPr>
@@ -20658,139 +20335,193 @@
           </mc:Choice>
           <mc:Fallback>
             <w:pict>
-              <v:group id="Gruppieren 29" o:spid="_x0000_s1039" style="position:absolute;margin-left:-20.55pt;margin-top:-.25pt;width:331.9pt;height:108.2pt;z-index:251795456" coordsize="42148,13744" o:gfxdata="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">
-                <v:rect id="Rechteck 7" o:spid="_x0000_s1040" style="position:absolute;width:42148;height:5143;visibility:visible;mso-wrap-style:square;v-text-anchor:middle" o:gfxdata="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" filled="f" strokecolor="#1f4d78 [1604]" strokeweight="1pt">
+              <v:group id="Gruppieren 29" o:spid="_x0000_s1039" style="position:absolute;margin-left:-20.55pt;margin-top:-.25pt;width:331.9pt;height:108.2pt;z-index:251795456" coordsize="42148,13744" o:gfxdata="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">
+                <v:rect id="Rechteck 7" o:spid="_x0000_s1040" style="position:absolute;width:42148;height:5143;visibility:visible;mso-wrap-style:square;v-text-anchor:middle" o:gfxdata="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" filled="f" strokecolor="black [3213]" strokeweight="1pt">
                   <v:stroke dashstyle="dash"/>
                 </v:rect>
-                <v:rect id="Rechteck 2" o:spid="_x0000_s1041" style="position:absolute;left:1086;top:1176;width:9436;height:2744;visibility:visible;mso-wrap-style:square;v-text-anchor:middle" o:gfxdata="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" fillcolor="#5b9bd5 [3204]" strokecolor="#1f4d78 [1604]" strokeweight="1pt">
+                <v:rect id="Rechteck 2" o:spid="_x0000_s1041" style="position:absolute;left:1086;top:1176;width:9436;height:2744;visibility:visible;mso-wrap-style:square;v-text-anchor:middle" o:gfxdata="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" filled="f" strokecolor="black [3213]" strokeweight="1pt">
                   <v:textbox>
                     <w:txbxContent>
                       <w:p>
                         <w:pPr>
                           <w:jc w:val="center"/>
+                          <w:rPr>
+                            <w:color w:val="000000" w:themeColor="text1"/>
+                          </w:rPr>
                         </w:pPr>
                         <w:r>
+                          <w:rPr>
+                            <w:color w:val="000000" w:themeColor="text1"/>
+                          </w:rPr>
                           <w:t>Zweipol [U]</w:t>
                         </w:r>
                       </w:p>
                     </w:txbxContent>
                   </v:textbox>
                 </v:rect>
-                <v:rect id="Rechteck 4" o:spid="_x0000_s1042" style="position:absolute;left:10773;top:1176;width:9436;height:2744;visibility:visible;mso-wrap-style:square;v-text-anchor:middle" o:gfxdata="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" fillcolor="#5b9bd5 [3204]" strokecolor="#1f4d78 [1604]" strokeweight="1pt">
+                <v:rect id="Rechteck 4" o:spid="_x0000_s1042" style="position:absolute;left:10773;top:1176;width:9436;height:2744;visibility:visible;mso-wrap-style:square;v-text-anchor:middle" o:gfxdata="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" filled="f" strokecolor="black [3213]" strokeweight="1pt">
                   <v:textbox>
                     <w:txbxContent>
                       <w:p>
                         <w:pPr>
                           <w:jc w:val="center"/>
+                          <w:rPr>
+                            <w:color w:val="000000" w:themeColor="text1"/>
+                          </w:rPr>
                         </w:pPr>
                         <w:r>
+                          <w:rPr>
+                            <w:color w:val="000000" w:themeColor="text1"/>
+                          </w:rPr>
+                          <w:t>Zweipol [I]</w:t>
+                        </w:r>
+                      </w:p>
+                    </w:txbxContent>
+                  </v:textbox>
+                </v:rect>
+                <v:rect id="Rechteck 5" o:spid="_x0000_s1043" style="position:absolute;left:20506;top:1176;width:10096;height:2744;visibility:visible;mso-wrap-style:square;v-text-anchor:middle" o:gfxdata="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" filled="f" strokecolor="black [3213]" strokeweight="1pt">
+                  <v:textbox>
+                    <w:txbxContent>
+                      <w:p>
+                        <w:pPr>
+                          <w:jc w:val="center"/>
+                          <w:rPr>
+                            <w:color w:val="000000" w:themeColor="text1"/>
+                          </w:rPr>
+                        </w:pPr>
+                        <w:r>
+                          <w:rPr>
+                            <w:color w:val="000000" w:themeColor="text1"/>
+                          </w:rPr>
+                          <w:t>Zweipol [R/G]</w:t>
+                        </w:r>
+                      </w:p>
+                    </w:txbxContent>
+                  </v:textbox>
+                </v:rect>
+                <v:rect id="Rechteck 6" o:spid="_x0000_s1044" style="position:absolute;left:30827;top:1176;width:10096;height:2744;visibility:visible;mso-wrap-style:square;v-text-anchor:middle" o:gfxdata="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" filled="f" strokecolor="black [3213]" strokeweight="1pt">
+                  <v:textbox>
+                    <w:txbxContent>
+                      <w:p>
+                        <w:pPr>
+                          <w:jc w:val="center"/>
+                          <w:rPr>
+                            <w:color w:val="000000" w:themeColor="text1"/>
+                          </w:rPr>
+                        </w:pPr>
+                        <w:r>
+                          <w:rPr>
+                            <w:color w:val="000000" w:themeColor="text1"/>
+                          </w:rPr>
+                          <w:t>Vierpol</w:t>
+                        </w:r>
+                      </w:p>
+                    </w:txbxContent>
+                  </v:textbox>
+                </v:rect>
+                <v:rect id="Rechteck 8" o:spid="_x0000_s1045" style="position:absolute;left:45;top:8600;width:31575;height:5144;visibility:visible;mso-wrap-style:square;v-text-anchor:middle" o:gfxdata="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" filled="f" strokecolor="black [3213]" strokeweight="1pt">
+                  <v:stroke dashstyle="dash"/>
+                </v:rect>
+                <v:rect id="Rechteck 14" o:spid="_x0000_s1046" style="position:absolute;left:1041;top:9868;width:9436;height:2743;visibility:visible;mso-wrap-style:square;v-text-anchor:middle" o:gfxdata="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" filled="f" strokecolor="black [3213]" strokeweight="1pt">
+                  <v:textbox>
+                    <w:txbxContent>
+                      <w:p>
+                        <w:pPr>
+                          <w:jc w:val="center"/>
+                          <w:rPr>
+                            <w:color w:val="000000" w:themeColor="text1"/>
+                          </w:rPr>
+                        </w:pPr>
+                        <w:r>
+                          <w:rPr>
+                            <w:color w:val="000000" w:themeColor="text1"/>
+                          </w:rPr>
+                          <w:t>Zweipol [U]</w:t>
+                        </w:r>
+                      </w:p>
+                    </w:txbxContent>
+                  </v:textbox>
+                </v:rect>
+                <v:rect id="Rechteck 15" o:spid="_x0000_s1047" style="position:absolute;left:10683;top:9868;width:9436;height:2743;visibility:visible;mso-wrap-style:square;v-text-anchor:middle" o:gfxdata="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" filled="f" strokecolor="black [3213]" strokeweight="1pt">
+                  <v:textbox>
+                    <w:txbxContent>
+                      <w:p>
+                        <w:pPr>
+                          <w:jc w:val="center"/>
+                          <w:rPr>
+                            <w:color w:val="000000" w:themeColor="text1"/>
+                          </w:rPr>
+                        </w:pPr>
+                        <w:r>
+                          <w:rPr>
+                            <w:color w:val="000000" w:themeColor="text1"/>
+                          </w:rPr>
+                          <w:t>Zweipol [I]</w:t>
+                        </w:r>
+                      </w:p>
+                    </w:txbxContent>
+                  </v:textbox>
+                </v:rect>
+                <v:rect id="Rechteck 17" o:spid="_x0000_s1048" style="position:absolute;left:20370;top:9868;width:10096;height:2743;visibility:visible;mso-wrap-style:square;v-text-anchor:middle" o:gfxdata="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" filled="f" strokecolor="black [3213]" strokeweight="1pt">
+                  <v:textbox>
+                    <w:txbxContent>
+                      <w:p>
+                        <w:pPr>
+                          <w:jc w:val="center"/>
+                          <w:rPr>
+                            <w:color w:val="000000" w:themeColor="text1"/>
+                          </w:rPr>
+                        </w:pPr>
+                        <w:r>
+                          <w:rPr>
+                            <w:color w:val="000000" w:themeColor="text1"/>
+                          </w:rPr>
                           <w:t>Zweipol [</w:t>
                         </w:r>
                         <w:r>
-                          <w:t>I</w:t>
+                          <w:rPr>
+                            <w:color w:val="000000" w:themeColor="text1"/>
+                          </w:rPr>
+                          <w:t>G</w:t>
                         </w:r>
                         <w:r>
+                          <w:rPr>
+                            <w:color w:val="000000" w:themeColor="text1"/>
+                          </w:rPr>
                           <w:t>]</w:t>
                         </w:r>
                       </w:p>
                     </w:txbxContent>
                   </v:textbox>
                 </v:rect>
-                <v:rect id="Rechteck 5" o:spid="_x0000_s1043" style="position:absolute;left:20506;top:1176;width:10096;height:2744;visibility:visible;mso-wrap-style:square;v-text-anchor:middle" o:gfxdata="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" fillcolor="#5b9bd5 [3204]" strokecolor="#1f4d78 [1604]" strokeweight="1pt">
-                  <v:textbox>
-                    <w:txbxContent>
-                      <w:p>
-                        <w:pPr>
-                          <w:jc w:val="center"/>
-                        </w:pPr>
-                        <w:r>
-                          <w:t>Zweipol [</w:t>
-                        </w:r>
-                        <w:r>
-                          <w:t>R/G]</w:t>
-                        </w:r>
-                      </w:p>
-                    </w:txbxContent>
-                  </v:textbox>
-                </v:rect>
-                <v:rect id="Rechteck 6" o:spid="_x0000_s1044" style="position:absolute;left:30827;top:1176;width:10096;height:2744;visibility:visible;mso-wrap-style:square;v-text-anchor:middle" o:gfxdata="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" fillcolor="#5b9bd5 [3204]" strokecolor="#1f4d78 [1604]" strokeweight="1pt">
-                  <v:textbox>
-                    <w:txbxContent>
-                      <w:p>
-                        <w:pPr>
-                          <w:jc w:val="center"/>
-                        </w:pPr>
-                        <w:r>
-                          <w:t>Vierpol</w:t>
-                        </w:r>
-                      </w:p>
-                    </w:txbxContent>
-                  </v:textbox>
-                </v:rect>
-                <v:rect id="Rechteck 8" o:spid="_x0000_s1045" style="position:absolute;left:45;top:8600;width:31575;height:5144;visibility:visible;mso-wrap-style:square;v-text-anchor:middle" o:gfxdata="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" filled="f" strokecolor="#1f4d78 [1604]" strokeweight="1pt">
-                  <v:stroke dashstyle="dash"/>
-                </v:rect>
-                <v:rect id="Rechteck 14" o:spid="_x0000_s1046" style="position:absolute;left:1041;top:9868;width:9436;height:2743;visibility:visible;mso-wrap-style:square;v-text-anchor:middle" o:gfxdata="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" fillcolor="#5b9bd5 [3204]" strokecolor="#1f4d78 [1604]" strokeweight="1pt">
-                  <v:textbox>
-                    <w:txbxContent>
-                      <w:p>
-                        <w:pPr>
-                          <w:jc w:val="center"/>
-                        </w:pPr>
-                        <w:r>
-                          <w:t>Zweipol [U]</w:t>
-                        </w:r>
-                      </w:p>
-                    </w:txbxContent>
-                  </v:textbox>
-                </v:rect>
-                <v:rect id="Rechteck 15" o:spid="_x0000_s1047" style="position:absolute;left:10683;top:9868;width:9436;height:2743;visibility:visible;mso-wrap-style:square;v-text-anchor:middle" o:gfxdata="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" fillcolor="#5b9bd5 [3204]" strokecolor="#1f4d78 [1604]" strokeweight="1pt">
-                  <v:textbox>
-                    <w:txbxContent>
-                      <w:p>
-                        <w:pPr>
-                          <w:jc w:val="center"/>
-                        </w:pPr>
-                        <w:r>
-                          <w:t>Zweipol [I]</w:t>
-                        </w:r>
-                      </w:p>
-                    </w:txbxContent>
-                  </v:textbox>
-                </v:rect>
-                <v:rect id="Rechteck 17" o:spid="_x0000_s1048" style="position:absolute;left:20370;top:9868;width:10096;height:2743;visibility:visible;mso-wrap-style:square;v-text-anchor:middle" o:gfxdata="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" fillcolor="#5b9bd5 [3204]" strokecolor="#1f4d78 [1604]" strokeweight="1pt">
-                  <v:textbox>
-                    <w:txbxContent>
-                      <w:p>
-                        <w:pPr>
-                          <w:jc w:val="center"/>
-                        </w:pPr>
-                        <w:r>
-                          <w:t>Zweipol [</w:t>
-                        </w:r>
-                        <w:r>
-                          <w:t>G</w:t>
-                        </w:r>
-                        <w:r>
-                          <w:t>]</w:t>
-                        </w:r>
-                      </w:p>
-                    </w:txbxContent>
-                  </v:textbox>
-                </v:rect>
-                <v:shape id="Gewinkelte Verbindung 20" o:spid="_x0000_s1049" type="#_x0000_t34" style="position:absolute;left:24896;top:-2852;width:5975;height:19644;rotation:90;visibility:visible;mso-wrap-style:square" o:connectortype="elbow" o:gfxdata="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" adj="12694" strokecolor="#5b9bd5 [3204]" strokeweight=".5pt">
+                <v:shapetype id="_x0000_t34" coordsize="21600,21600" o:spt="34" o:oned="t" adj="10800" path="m,l@0,0@0,21600,21600,21600e" filled="f">
+                  <v:stroke joinstyle="miter"/>
+                  <v:formulas>
+                    <v:f eqn="val #0"/>
+                  </v:formulas>
+                  <v:path arrowok="t" fillok="f" o:connecttype="none"/>
+                  <v:handles>
+                    <v:h position="#0,center"/>
+                  </v:handles>
+                  <o:lock v:ext="edit" shapetype="t"/>
+                </v:shapetype>
+                <v:shape id="Gewinkelte Verbindung 20" o:spid="_x0000_s1049" type="#_x0000_t34" style="position:absolute;left:24896;top:-2852;width:5975;height:19644;rotation:90;visibility:visible;mso-wrap-style:square" o:connectortype="elbow" o:gfxdata="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" adj="12694" strokecolor="black [3213]" strokeweight=".5pt">
                   <v:stroke endarrow="block"/>
                 </v:shape>
-                <v:shape id="Gewinkelte Verbindung 23" o:spid="_x0000_s1050" type="#_x0000_t34" style="position:absolute;left:2037;top:6201;width:5844;height:1544;rotation:90;visibility:visible;mso-wrap-style:square" o:connectortype="elbow" o:gfxdata="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" adj="9625" strokecolor="#5b9bd5 [3204]" strokeweight=".5pt">
+                <v:shape id="Gewinkelte Verbindung 23" o:spid="_x0000_s1050" type="#_x0000_t34" style="position:absolute;left:2037;top:6201;width:5844;height:1544;rotation:90;visibility:visible;mso-wrap-style:square" o:connectortype="elbow" o:gfxdata="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" adj="9625" strokecolor="black [3213]" strokeweight=".5pt">
                   <v:stroke endarrow="block"/>
                 </v:shape>
-                <v:shape id="Gewinkelte Verbindung 24" o:spid="_x0000_s1051" type="#_x0000_t34" style="position:absolute;left:17744;top:-6745;width:5912;height:27248;rotation:90;visibility:visible;mso-wrap-style:square" o:connectortype="elbow" o:gfxdata="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" adj="9582" strokecolor="#5b9bd5 [3204]" strokeweight=".5pt">
+                <v:shape id="Gewinkelte Verbindung 24" o:spid="_x0000_s1051" type="#_x0000_t34" style="position:absolute;left:17744;top:-6745;width:5912;height:27248;rotation:90;visibility:visible;mso-wrap-style:square" o:connectortype="elbow" o:gfxdata="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" adj="9582" strokecolor="black [3213]" strokeweight=".5pt">
                   <v:stroke endarrow="block"/>
                 </v:shape>
-                <v:shape id="Gewinkelte Verbindung 26" o:spid="_x0000_s1052" type="#_x0000_t34" style="position:absolute;left:12131;top:6156;width:5844;height:1544;rotation:90;visibility:visible;mso-wrap-style:square" o:connectortype="elbow" o:gfxdata="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" adj="12971" strokecolor="#5b9bd5 [3204]" strokeweight=".5pt">
+                <v:shape id="Gewinkelte Verbindung 26" o:spid="_x0000_s1052" type="#_x0000_t34" style="position:absolute;left:12131;top:6156;width:5844;height:1544;rotation:90;visibility:visible;mso-wrap-style:square" o:connectortype="elbow" o:gfxdata="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" adj="12971" strokecolor="black [3213]" strokeweight=".5pt">
                   <v:stroke endarrow="block"/>
                 </v:shape>
-                <v:shape id="Gerade Verbindung mit Pfeil 28" o:spid="_x0000_s1053" type="#_x0000_t32" style="position:absolute;left:25802;top:3983;width:0;height:5797;visibility:visible;mso-wrap-style:square" o:connectortype="straight" o:gfxdata="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" strokecolor="#5b9bd5 [3204]" strokeweight=".5pt">
+                <v:shapetype id="_x0000_t32" coordsize="21600,21600" o:spt="32" o:oned="t" path="m,l21600,21600e" filled="f">
+                  <v:path arrowok="t" fillok="f" o:connecttype="none"/>
+                  <o:lock v:ext="edit" shapetype="t"/>
+                </v:shapetype>
+                <v:shape id="Gerade Verbindung mit Pfeil 28" o:spid="_x0000_s1053" type="#_x0000_t32" style="position:absolute;left:25802;top:3983;width:0;height:5797;visibility:visible;mso-wrap-style:square" o:connectortype="straight" o:gfxdata="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" strokecolor="black [3213]" strokeweight=".5pt">
                   <v:stroke endarrow="block" joinstyle="miter"/>
                 </v:shape>
               </v:group>
@@ -20830,6 +20561,8 @@
           <w:lang w:val="en-US"/>
         </w:rPr>
       </w:pPr>
+      <w:bookmarkStart w:id="0" w:name="_GoBack"/>
+      <w:bookmarkEnd w:id="0"/>
     </w:p>
     <w:sectPr>
       <w:pgSz w:w="11906" w:h="16838"/>

</xml_diff>